<commit_message>
docs: clarify member tasks and next steps
</commit_message>
<xml_diff>
--- a/output/docx/软件开发实践一立项报告.docx
+++ b/output/docx/软件开发实践一立项报告.docx
@@ -281,7 +281,7 @@
             <w:pPr>
               <w:spacing w:after="0" w:line="300"/>
             </w:pPr>
-            <w:hyperlink w:history="1" r:id="rIdzk6gdvorbqxxsrieomdt4">
+            <w:hyperlink w:history="1" r:id="rIdrhe_9opdf0j8qmp40zves">
               <w:r>
                 <w:rPr>
                   <w:rFonts w:ascii="Arial Unicode MS" w:cs="Arial Unicode MS" w:eastAsia="Arial Unicode MS" w:hAnsi="Arial Unicode MS"/>
@@ -415,7 +415,7 @@
             <w:pPr>
               <w:spacing w:after="0" w:line="300"/>
             </w:pPr>
-            <w:hyperlink w:history="1" r:id="rIdvefdorkiyf4xwc7crpy7h">
+            <w:hyperlink w:history="1" r:id="rIdcmbsafljszxa_ays7tyvj">
               <w:r>
                 <w:rPr>
                   <w:rFonts w:ascii="Arial Unicode MS" w:cs="Arial Unicode MS" w:eastAsia="Arial Unicode MS" w:hAnsi="Arial Unicode MS"/>
@@ -549,7 +549,7 @@
             <w:pPr>
               <w:spacing w:after="0" w:line="300"/>
             </w:pPr>
-            <w:hyperlink w:history="1" r:id="rIdpovqqt77u0jdhbl0i8tav">
+            <w:hyperlink w:history="1" r:id="rIdjigxnfc2iupbomu2k5swv">
               <w:r>
                 <w:rPr>
                   <w:rFonts w:ascii="Arial Unicode MS" w:cs="Arial Unicode MS" w:eastAsia="Arial Unicode MS" w:hAnsi="Arial Unicode MS"/>
@@ -733,7 +733,7 @@
         <w:spacing w:after="120" w:line="360"/>
         <w:ind w:left="420" w:hanging="240"/>
       </w:pPr>
-      <w:hyperlink w:history="1" r:id="rId1ity0lj7hvsglbfyinp_z">
+      <w:hyperlink w:history="1" r:id="rId1ocwkrqmypnfhy6tuly1-">
         <w:r>
           <w:rPr>
             <w:rFonts w:ascii="Arial Unicode MS" w:cs="Arial Unicode MS" w:eastAsia="Arial Unicode MS" w:hAnsi="Arial Unicode MS"/>
@@ -764,7 +764,7 @@
         <w:spacing w:after="120" w:line="360"/>
         <w:ind w:left="420" w:hanging="240"/>
       </w:pPr>
-      <w:hyperlink w:history="1" r:id="rIdqp5fdilomm9mo05lk7vgc">
+      <w:hyperlink w:history="1" r:id="rId0wcmlqrutr2d78pnwfhsl">
         <w:r>
           <w:rPr>
             <w:rFonts w:ascii="Arial Unicode MS" w:cs="Arial Unicode MS" w:eastAsia="Arial Unicode MS" w:hAnsi="Arial Unicode MS"/>
@@ -795,7 +795,7 @@
         <w:spacing w:after="120" w:line="360"/>
         <w:ind w:left="420" w:hanging="240"/>
       </w:pPr>
-      <w:hyperlink w:history="1" r:id="rIdinc4ncyr9g7wdegffdy0o">
+      <w:hyperlink w:history="1" r:id="rId2g_3103mrfr6c-92vinwq">
         <w:r>
           <w:rPr>
             <w:rFonts w:ascii="Arial Unicode MS" w:cs="Arial Unicode MS" w:eastAsia="Arial Unicode MS" w:hAnsi="Arial Unicode MS"/>
@@ -826,7 +826,7 @@
         <w:spacing w:after="120" w:line="360"/>
         <w:ind w:left="420" w:hanging="240"/>
       </w:pPr>
-      <w:hyperlink w:history="1" r:id="rId9th4fekqmhwvksftdrpc9">
+      <w:hyperlink w:history="1" r:id="rIdyt_u--96yaefc7jpisbdx">
         <w:r>
           <w:rPr>
             <w:rFonts w:ascii="Arial Unicode MS" w:cs="Arial Unicode MS" w:eastAsia="Arial Unicode MS" w:hAnsi="Arial Unicode MS"/>
@@ -2477,6 +2477,130 @@
       <w:pPr>
         <w:spacing w:after="80"/>
       </w:pPr>
+    </w:p>
+    <w:p>
+      <w:pPr>
+        <w:spacing w:after="120" w:line="360"/>
+      </w:pPr>
+      <w:r>
+        <w:rPr>
+          <w:rFonts w:ascii="Arial Unicode MS" w:cs="Arial Unicode MS" w:eastAsia="Arial Unicode MS" w:hAnsi="Arial Unicode MS"/>
+          <w:sz w:val="22"/>
+          <w:szCs w:val="22"/>
+        </w:rPr>
+        <w:t xml:space="preserve">各成员下一步按以下顺序推进：</w:t>
+      </w:r>
+    </w:p>
+    <w:p>
+      <w:pPr>
+        <w:pStyle w:val="ListParagraph"/>
+        <w:numPr>
+          <w:ilvl w:val="0"/>
+          <w:numId w:val="3"/>
+        </w:numPr>
+        <w:spacing w:after="120" w:line="360"/>
+        <w:ind w:left="420" w:hanging="240"/>
+      </w:pPr>
+      <w:r>
+        <w:rPr>
+          <w:rFonts w:ascii="Arial Unicode MS" w:cs="Arial Unicode MS" w:eastAsia="Arial Unicode MS" w:hAnsi="Arial Unicode MS"/>
+          <w:sz w:val="22"/>
+          <w:szCs w:val="22"/>
+        </w:rPr>
+        <w:t xml:space="preserve">卢世豪：先确认清洗数据字段，再完成 KMeans 聚类和随机森林薪资预测，最后提供函数输入输出、指标和异常状态。</w:t>
+      </w:r>
+    </w:p>
+    <w:p>
+      <w:pPr>
+        <w:pStyle w:val="ListParagraph"/>
+        <w:numPr>
+          <w:ilvl w:val="0"/>
+          <w:numId w:val="3"/>
+        </w:numPr>
+        <w:spacing w:after="120" w:line="360"/>
+        <w:ind w:left="420" w:hanging="240"/>
+      </w:pPr>
+      <w:r>
+        <w:rPr>
+          <w:rFonts w:ascii="Arial Unicode MS" w:cs="Arial Unicode MS" w:eastAsia="Arial Unicode MS" w:hAnsi="Arial Unicode MS"/>
+          <w:sz w:val="22"/>
+          <w:szCs w:val="22"/>
+        </w:rPr>
+        <w:t xml:space="preserve">丁伟哲：先确认岗位文本和学生画像字段，再完成 TF-IDF 推荐和匹配技能解释，最后用 3 组画像交给后端联调。</w:t>
+      </w:r>
+    </w:p>
+    <w:p>
+      <w:pPr>
+        <w:pStyle w:val="ListParagraph"/>
+        <w:numPr>
+          <w:ilvl w:val="0"/>
+          <w:numId w:val="3"/>
+        </w:numPr>
+        <w:spacing w:after="120" w:line="360"/>
+        <w:ind w:left="420" w:hanging="240"/>
+      </w:pPr>
+      <w:r>
+        <w:rPr>
+          <w:rFonts w:ascii="Arial Unicode MS" w:cs="Arial Unicode MS" w:eastAsia="Arial Unicode MS" w:hAnsi="Arial Unicode MS"/>
+          <w:sz w:val="22"/>
+          <w:szCs w:val="22"/>
+        </w:rPr>
+        <w:t xml:space="preserve">郑维豪：先确定公开数据源并建立数据字典，再完成去重、缺失值、薪资和地区标准化，最后输出 </w:t>
+      </w:r>
+      <w:r>
+        <w:rPr>
+          <w:rFonts w:ascii="Arial Unicode MS" w:cs="Arial Unicode MS" w:eastAsia="Arial Unicode MS" w:hAnsi="Arial Unicode MS"/>
+          <w:sz w:val="22"/>
+          <w:szCs w:val="22"/>
+        </w:rPr>
+        <w:t xml:space="preserve">jobs.csv</w:t>
+      </w:r>
+      <w:r>
+        <w:rPr>
+          <w:rFonts w:ascii="Arial Unicode MS" w:cs="Arial Unicode MS" w:eastAsia="Arial Unicode MS" w:hAnsi="Arial Unicode MS"/>
+          <w:sz w:val="22"/>
+          <w:szCs w:val="22"/>
+        </w:rPr>
+        <w:t xml:space="preserve"> 和处理记录。</w:t>
+      </w:r>
+    </w:p>
+    <w:p>
+      <w:pPr>
+        <w:pStyle w:val="ListParagraph"/>
+        <w:numPr>
+          <w:ilvl w:val="0"/>
+          <w:numId w:val="3"/>
+        </w:numPr>
+        <w:spacing w:after="120" w:line="360"/>
+        <w:ind w:left="420" w:hanging="240"/>
+      </w:pPr>
+      <w:r>
+        <w:rPr>
+          <w:rFonts w:ascii="Arial Unicode MS" w:cs="Arial Unicode MS" w:eastAsia="Arial Unicode MS" w:hAnsi="Arial Unicode MS"/>
+          <w:sz w:val="22"/>
+          <w:szCs w:val="22"/>
+        </w:rPr>
+        <w:t xml:space="preserve">徐挚凌：先固定数据路径和服务函数签名，再完成岗位筛选、统计和算法调用，最后和前端走通一条完整链路。</w:t>
+      </w:r>
+    </w:p>
+    <w:p>
+      <w:pPr>
+        <w:pStyle w:val="ListParagraph"/>
+        <w:numPr>
+          <w:ilvl w:val="0"/>
+          <w:numId w:val="3"/>
+        </w:numPr>
+        <w:spacing w:after="120" w:line="360"/>
+        <w:ind w:left="420" w:hanging="240"/>
+      </w:pPr>
+      <w:r>
+        <w:rPr>
+          <w:rFonts w:ascii="Arial Unicode MS" w:cs="Arial Unicode MS" w:eastAsia="Arial Unicode MS" w:hAnsi="Arial Unicode MS"/>
+          <w:sz w:val="22"/>
+          <w:szCs w:val="22"/>
+        </w:rPr>
+        <w:t xml:space="preserve">王宇杰：先搭好四个页面功能区，再接入筛选、统计和算法结果，最后测试正常、空数据和模型未加载状态并保留演示截图。</w:t>
+      </w:r>
     </w:p>
     <w:p>
       <w:pPr>

</xml_diff>